<commit_message>
Rebuild Practical 3 report from reference format
</commit_message>
<xml_diff>
--- a/pract-3-awdf-24cs105.docx
+++ b/pract-3-awdf-24cs105.docx
@@ -142,15 +142,6 @@
               </w:rPr>
               <w:t>24CS105</w:t>
             </w:r>
-            <w:r>
-              <w:rPr>
-                <w:rFonts w:hint="default" w:ascii="Times New Roman" w:hAnsi="Times New Roman" w:eastAsia="Times New Roman" w:cs="Times New Roman"/>
-                <w:b/>
-                <w:sz w:val="24"/>
-                <w:szCs w:val="24"/>
-                <w:lang w:val="en-IN"/>
-              </w:rPr>
-            </w:r>
           </w:p>
         </w:tc>
         <w:tc>
@@ -708,8 +699,6 @@
               </w:rPr>
               <w:br w:type="textWrapping"/>
             </w:r>
-            <w:bookmarkStart w:id="1" w:name="_GoBack"/>
-            <w:bookmarkEnd w:id="1"/>
           </w:p>
         </w:tc>
       </w:tr>
@@ -743,21 +732,12 @@
               <w:jc w:val="left"/>
             </w:pPr>
             <w:r>
+              <w:rPr>
+                <w:rFonts w:ascii="Times New Roman" w:hAnsi="Times New Roman"/>
+                <w:b/>
+                <w:sz w:val="22"/>
+              </w:rPr>
               <w:t>GitHub Link Repository Link: https://github.com/24CS105-RUDRA/24CS105-AWDF-Practical3</w:t>
-            </w:r>
-            <w:r>
-              <w:rPr>
-                <w:rFonts w:ascii="Times New Roman" w:hAnsi="Times New Roman"/>
-                <w:b/>
-                <w:sz w:val="22"/>
-              </w:rPr>
-            </w:r>
-            <w:r>
-              <w:rPr>
-                <w:rFonts w:ascii="Times New Roman" w:hAnsi="Times New Roman"/>
-                <w:b/>
-                <w:sz w:val="22"/>
-              </w:rPr>
             </w:r>
           </w:p>
         </w:tc>
@@ -836,30 +816,30 @@
                 <w:b/>
                 <w:sz w:val="22"/>
               </w:rPr>
-              <w:br/>
+              <w:br w:type="textWrapping"/>
+            </w:r>
+            <w:r>
+              <w:rPr>
+                <w:rFonts w:ascii="Times New Roman" w:hAnsi="Times New Roman"/>
+                <w:b/>
+                <w:sz w:val="22"/>
+              </w:rPr>
               <w:t>1. Asynchronous REST API Integration (GitHub API):</w:t>
-              <w:br/>
+            </w:r>
+            <w:r>
+              <w:rPr>
+                <w:rFonts w:ascii="Times New Roman" w:hAnsi="Times New Roman"/>
+                <w:b/>
+                <w:sz w:val="22"/>
+              </w:rPr>
+              <w:br w:type="textWrapping"/>
+            </w:r>
+            <w:r>
+              <w:rPr>
+                <w:rFonts w:ascii="Times New Roman" w:hAnsi="Times New Roman"/>
+                <w:sz w:val="22"/>
+              </w:rPr>
               <w:t>Implemented dynamic data fetching on component mount via React’s useEffect hook using the public GitHub REST API endpoint (https://api.github.com/users/24CS105-RUDRA/repos?sort=updated). The API call is cleanly encapsulated with dependency arrays to prevent re-fetching loops.</w:t>
-            </w:r>
-            <w:r>
-              <w:rPr>
-                <w:rFonts w:ascii="Times New Roman" w:hAnsi="Times New Roman"/>
-                <w:b/>
-                <w:sz w:val="22"/>
-              </w:rPr>
-            </w:r>
-            <w:r>
-              <w:rPr>
-                <w:rFonts w:ascii="Times New Roman" w:hAnsi="Times New Roman"/>
-                <w:b/>
-                <w:sz w:val="22"/>
-              </w:rPr>
-            </w:r>
-            <w:r>
-              <w:rPr>
-                <w:rFonts w:ascii="Times New Roman" w:hAnsi="Times New Roman"/>
-                <w:sz w:val="22"/>
-              </w:rPr>
             </w:r>
           </w:p>
           <w:p>
@@ -1119,12 +1099,66 @@
               <w:spacing w:before="240" w:after="80"/>
               <w:jc w:val="center"/>
             </w:pPr>
+          </w:p>
+          <w:p>
+            <w:pPr>
+              <w:spacing w:after="240"/>
+              <w:jc w:val="center"/>
+            </w:pPr>
+            <w:r>
+              <w:rPr>
+                <w:rFonts w:ascii="Times New Roman" w:hAnsi="Times New Roman"/>
+                <w:b/>
+                <w:i/>
+                <w:sz w:val="20"/>
+              </w:rPr>
+              <w:t>Figure 1: GitHub Repositories Successfully Fetched and Rendered Dynamically with Star Counts and Metadata</w:t>
+            </w:r>
+          </w:p>
+          <w:p>
+            <w:pPr>
+              <w:spacing w:before="240" w:after="80"/>
+              <w:jc w:val="center"/>
+            </w:pPr>
+          </w:p>
+          <w:p>
+            <w:pPr>
+              <w:spacing w:after="240"/>
+              <w:jc w:val="center"/>
+            </w:pPr>
+            <w:r>
+              <w:rPr>
+                <w:rFonts w:ascii="Times New Roman" w:hAnsi="Times New Roman"/>
+                <w:b/>
+                <w:i/>
+                <w:sz w:val="20"/>
+              </w:rPr>
+              <w:t>Figure 2: Loading State Feedback with Animated Spinner (&lt;Spinner /&gt;) During Asynchronous Fetch</w:t>
+            </w:r>
+          </w:p>
+          <w:p>
+            <w:pPr>
+              <w:spacing w:before="240" w:after="80"/>
+              <w:jc w:val="center"/>
+            </w:pPr>
+          </w:p>
+          <w:p>
+            <w:pPr>
+              <w:spacing w:before="240" w:after="80"/>
+              <w:jc w:val="center"/>
+            </w:pPr>
+          </w:p>
+          <w:p>
+            <w:pPr>
+              <w:spacing w:before="240" w:after="80"/>
+              <w:jc w:val="center"/>
+            </w:pPr>
             <w:r>
               <w:drawing>
                 <wp:inline distT="0" distB="0" distL="114300" distR="114300">
-                  <wp:extent cx="6217920" cy="4128770"/>
-                  <wp:effectExtent l="0" t="0" r="0" b="1270"/>
-                  <wp:docPr id="1" name="Picture 1"/>
+                  <wp:extent cx="6533515" cy="2009775"/>
+                  <wp:effectExtent l="0" t="0" r="4445" b="1905"/>
+                  <wp:docPr id="8" name="Picture 4"/>
                   <wp:cNvGraphicFramePr>
                     <a:graphicFrameLocks xmlns:a="http://schemas.openxmlformats.org/drawingml/2006/main" noChangeAspect="1"/>
                   </wp:cNvGraphicFramePr>
@@ -1132,7 +1166,7 @@
                     <a:graphicData uri="http://schemas.openxmlformats.org/drawingml/2006/picture">
                       <pic:pic xmlns:pic="http://schemas.openxmlformats.org/drawingml/2006/picture">
                         <pic:nvPicPr>
-                          <pic:cNvPr id="1" name="Picture 1"/>
+                          <pic:cNvPr id="8" name="Picture 4"/>
                           <pic:cNvPicPr>
                             <a:picLocks noChangeAspect="1"/>
                           </pic:cNvPicPr>
@@ -1146,11 +1180,15 @@
                         <pic:spPr>
                           <a:xfrm>
                             <a:off x="0" y="0"/>
-                            <a:ext cx="6217920" cy="4129088"/>
+                            <a:ext cx="6533515" cy="2009775"/>
                           </a:xfrm>
                           <a:prstGeom prst="rect">
                             <a:avLst/>
                           </a:prstGeom>
+                          <a:noFill/>
+                          <a:ln>
+                            <a:noFill/>
+                          </a:ln>
                         </pic:spPr>
                       </pic:pic>
                     </a:graphicData>
@@ -1161,30 +1199,15 @@
           </w:p>
           <w:p>
             <w:pPr>
-              <w:spacing w:after="240"/>
-              <w:jc w:val="center"/>
-            </w:pPr>
-            <w:r>
-              <w:rPr>
-                <w:rFonts w:ascii="Times New Roman" w:hAnsi="Times New Roman"/>
-                <w:b/>
-                <w:i/>
-                <w:sz w:val="20"/>
-              </w:rPr>
-              <w:t>Figure 1: GitHub Repositories Successfully Fetched and Rendered Dynamically with Star Counts and Metadata</w:t>
-            </w:r>
-          </w:p>
-          <w:p>
-            <w:pPr>
               <w:spacing w:before="240" w:after="80"/>
               <w:jc w:val="center"/>
             </w:pPr>
             <w:r>
               <w:drawing>
                 <wp:inline distT="0" distB="0" distL="114300" distR="114300">
-                  <wp:extent cx="6217920" cy="4128770"/>
-                  <wp:effectExtent l="0" t="0" r="0" b="1270"/>
-                  <wp:docPr id="2" name="Picture 2"/>
+                  <wp:extent cx="6534785" cy="4487545"/>
+                  <wp:effectExtent l="0" t="0" r="3175" b="8255"/>
+                  <wp:docPr id="5" name="Picture 1"/>
                   <wp:cNvGraphicFramePr>
                     <a:graphicFrameLocks xmlns:a="http://schemas.openxmlformats.org/drawingml/2006/main" noChangeAspect="1"/>
                   </wp:cNvGraphicFramePr>
@@ -1192,7 +1215,7 @@
                     <a:graphicData uri="http://schemas.openxmlformats.org/drawingml/2006/picture">
                       <pic:pic xmlns:pic="http://schemas.openxmlformats.org/drawingml/2006/picture">
                         <pic:nvPicPr>
-                          <pic:cNvPr id="2" name="Picture 2"/>
+                          <pic:cNvPr id="5" name="Picture 1"/>
                           <pic:cNvPicPr>
                             <a:picLocks noChangeAspect="1"/>
                           </pic:cNvPicPr>
@@ -1206,11 +1229,15 @@
                         <pic:spPr>
                           <a:xfrm>
                             <a:off x="0" y="0"/>
-                            <a:ext cx="6217920" cy="4129088"/>
+                            <a:ext cx="6534785" cy="4487545"/>
                           </a:xfrm>
                           <a:prstGeom prst="rect">
                             <a:avLst/>
                           </a:prstGeom>
+                          <a:noFill/>
+                          <a:ln>
+                            <a:noFill/>
+                          </a:ln>
                         </pic:spPr>
                       </pic:pic>
                     </a:graphicData>
@@ -1221,30 +1248,21 @@
           </w:p>
           <w:p>
             <w:pPr>
-              <w:spacing w:after="240"/>
-              <w:jc w:val="center"/>
-            </w:pPr>
-            <w:r>
-              <w:rPr>
-                <w:rFonts w:ascii="Times New Roman" w:hAnsi="Times New Roman"/>
-                <w:b/>
-                <w:i/>
-                <w:sz w:val="20"/>
-              </w:rPr>
-              <w:t>Figure 2: Loading State Feedback with Animated Spinner (&lt;Spinner /&gt;) During Asynchronous Fetch</w:t>
-            </w:r>
-          </w:p>
-          <w:p>
-            <w:pPr>
               <w:spacing w:before="240" w:after="80"/>
               <w:jc w:val="center"/>
             </w:pPr>
+          </w:p>
+          <w:p>
+            <w:pPr>
+              <w:spacing w:before="240" w:after="80"/>
+              <w:jc w:val="center"/>
+            </w:pPr>
             <w:r>
               <w:drawing>
                 <wp:inline distT="0" distB="0" distL="114300" distR="114300">
-                  <wp:extent cx="6217920" cy="4128770"/>
-                  <wp:effectExtent l="0" t="0" r="0" b="1270"/>
-                  <wp:docPr id="3" name="Picture 3"/>
+                  <wp:extent cx="6534785" cy="3691890"/>
+                  <wp:effectExtent l="0" t="0" r="3175" b="11430"/>
+                  <wp:docPr id="6" name="Picture 2"/>
                   <wp:cNvGraphicFramePr>
                     <a:graphicFrameLocks xmlns:a="http://schemas.openxmlformats.org/drawingml/2006/main" noChangeAspect="1"/>
                   </wp:cNvGraphicFramePr>
@@ -1252,7 +1270,7 @@
                     <a:graphicData uri="http://schemas.openxmlformats.org/drawingml/2006/picture">
                       <pic:pic xmlns:pic="http://schemas.openxmlformats.org/drawingml/2006/picture">
                         <pic:nvPicPr>
-                          <pic:cNvPr id="3" name="Picture 3"/>
+                          <pic:cNvPr id="6" name="Picture 2"/>
                           <pic:cNvPicPr>
                             <a:picLocks noChangeAspect="1"/>
                           </pic:cNvPicPr>
@@ -1266,11 +1284,15 @@
                         <pic:spPr>
                           <a:xfrm>
                             <a:off x="0" y="0"/>
-                            <a:ext cx="6217920" cy="4129088"/>
+                            <a:ext cx="6534785" cy="3691890"/>
                           </a:xfrm>
                           <a:prstGeom prst="rect">
                             <a:avLst/>
                           </a:prstGeom>
+                          <a:noFill/>
+                          <a:ln>
+                            <a:noFill/>
+                          </a:ln>
                         </pic:spPr>
                       </pic:pic>
                     </a:graphicData>
@@ -1281,30 +1303,21 @@
           </w:p>
           <w:p>
             <w:pPr>
-              <w:spacing w:after="240"/>
-              <w:jc w:val="center"/>
-            </w:pPr>
-            <w:r>
-              <w:rPr>
-                <w:rFonts w:ascii="Times New Roman" w:hAnsi="Times New Roman"/>
-                <w:b/>
-                <w:i/>
-                <w:sz w:val="20"/>
-              </w:rPr>
-              <w:t>Figure 3: Comprehensive Error Handling (&lt;ErrorMessage /&gt;) with Troubleshooting Notes and Retry Button</w:t>
-            </w:r>
-          </w:p>
-          <w:p>
-            <w:pPr>
               <w:spacing w:before="240" w:after="80"/>
               <w:jc w:val="center"/>
             </w:pPr>
+          </w:p>
+          <w:p>
+            <w:pPr>
+              <w:spacing w:before="240" w:after="80"/>
+              <w:jc w:val="center"/>
+            </w:pPr>
             <w:r>
               <w:drawing>
                 <wp:inline distT="0" distB="0" distL="114300" distR="114300">
-                  <wp:extent cx="6217920" cy="4128770"/>
-                  <wp:effectExtent l="0" t="0" r="0" b="1270"/>
-                  <wp:docPr id="4" name="Picture 4"/>
+                  <wp:extent cx="4914900" cy="3680460"/>
+                  <wp:effectExtent l="0" t="0" r="7620" b="7620"/>
+                  <wp:docPr id="7" name="Picture 3"/>
                   <wp:cNvGraphicFramePr>
                     <a:graphicFrameLocks xmlns:a="http://schemas.openxmlformats.org/drawingml/2006/main" noChangeAspect="1"/>
                   </wp:cNvGraphicFramePr>
@@ -1312,7 +1325,7 @@
                     <a:graphicData uri="http://schemas.openxmlformats.org/drawingml/2006/picture">
                       <pic:pic xmlns:pic="http://schemas.openxmlformats.org/drawingml/2006/picture">
                         <pic:nvPicPr>
-                          <pic:cNvPr id="4" name="Picture 4"/>
+                          <pic:cNvPr id="7" name="Picture 3"/>
                           <pic:cNvPicPr>
                             <a:picLocks noChangeAspect="1"/>
                           </pic:cNvPicPr>
@@ -1326,11 +1339,15 @@
                         <pic:spPr>
                           <a:xfrm>
                             <a:off x="0" y="0"/>
-                            <a:ext cx="6217920" cy="4129088"/>
+                            <a:ext cx="4914900" cy="3680460"/>
                           </a:xfrm>
                           <a:prstGeom prst="rect">
                             <a:avLst/>
                           </a:prstGeom>
+                          <a:noFill/>
+                          <a:ln>
+                            <a:noFill/>
+                          </a:ln>
                         </pic:spPr>
                       </pic:pic>
                     </a:graphicData>
@@ -1338,6 +1355,35 @@
                 </wp:inline>
               </w:drawing>
             </w:r>
+          </w:p>
+          <w:p>
+            <w:pPr>
+              <w:spacing w:before="240" w:after="80"/>
+              <w:jc w:val="center"/>
+            </w:pPr>
+          </w:p>
+          <w:p>
+            <w:pPr>
+              <w:spacing w:after="240"/>
+              <w:jc w:val="center"/>
+            </w:pPr>
+            <w:r>
+              <w:rPr>
+                <w:rFonts w:ascii="Times New Roman" w:hAnsi="Times New Roman"/>
+                <w:b/>
+                <w:i/>
+                <w:sz w:val="20"/>
+              </w:rPr>
+              <w:t>Figure 3: Comprehensive Error Handling (&lt;ErrorMessage /&gt;) with Troubleshooting Notes and Retry Button</w:t>
+            </w:r>
+          </w:p>
+          <w:p>
+            <w:pPr>
+              <w:spacing w:before="240" w:after="80"/>
+              <w:jc w:val="center"/>
+            </w:pPr>
+            <w:bookmarkStart w:id="1" w:name="_GoBack"/>
+            <w:bookmarkEnd w:id="1"/>
           </w:p>
           <w:p>
             <w:pPr>
@@ -1424,6 +1470,17 @@
           <w:szCs w:val="24"/>
         </w:rPr>
       </w:pPr>
+    </w:p>
+    <w:p>
+      <w:r>
+        <w:rPr>
+          <w:b/>
+        </w:rPr>
+        <w:t xml:space="preserve">Student Information: </w:t>
+      </w:r>
+      <w:r>
+        <w:t>Rudra Vaghela | ID: 24CS105 | Email: 24cs105@charusat.edu.in | Semester: 5th Sem | Program: B.Tech | Department: CSE-CSPIT</w:t>
+      </w:r>
     </w:p>
     <w:sectPr>
       <w:headerReference r:id="rId7" w:type="first"/>
@@ -1664,60 +1721,33 @@
         <w:szCs w:val="18"/>
       </w:rPr>
       <w:t xml:space="preserve">ITUE301: Advance Web Development Framework </w:t>
-      <w:tab/>
-      <w:tab/>
-      <w:t xml:space="preserve">       24CS105</w:t>
     </w:r>
     <w:r>
       <w:rPr>
         <w:rFonts w:ascii="Cambria" w:hAnsi="Cambria" w:eastAsia="Cambria" w:cs="Cambria"/>
         <w:b/>
-        <w:color w:val="000000"/>
         <w:sz w:val="18"/>
         <w:szCs w:val="18"/>
       </w:rPr>
-    </w:r>
-    <w:r>
-      <w:rPr>
-        <w:rFonts w:ascii="Times New Roman" w:hAnsi="Times New Roman" w:eastAsia="Times New Roman" w:cs="Times New Roman"/>
-        <w:b/>
-        <w:sz w:val="20"/>
-        <w:szCs w:val="20"/>
-      </w:rPr>
+      <w:tab/>
     </w:r>
     <w:r>
       <w:rPr>
         <w:rFonts w:ascii="Cambria" w:hAnsi="Cambria" w:eastAsia="Cambria" w:cs="Cambria"/>
         <w:b/>
-        <w:color w:val="000000"/>
+        <w:sz w:val="18"/>
+        <w:szCs w:val="18"/>
       </w:rPr>
+      <w:tab/>
     </w:r>
     <w:r>
       <w:rPr>
         <w:rFonts w:ascii="Cambria" w:hAnsi="Cambria" w:eastAsia="Cambria" w:cs="Cambria"/>
         <w:b/>
-        <w:color w:val="000000"/>
+        <w:sz w:val="18"/>
+        <w:szCs w:val="18"/>
       </w:rPr>
-    </w:r>
-    <w:r>
-      <w:rPr>
-        <w:rFonts w:ascii="Cambria" w:hAnsi="Cambria" w:eastAsia="Cambria" w:cs="Cambria"/>
-        <w:b/>
-        <w:color w:val="000000"/>
-      </w:rPr>
-    </w:r>
-    <w:r>
-      <w:rPr>
-        <w:rFonts w:ascii="Cambria" w:hAnsi="Cambria" w:eastAsia="Cambria" w:cs="Cambria"/>
-        <w:b/>
-      </w:rPr>
-    </w:r>
-    <w:r>
-      <w:rPr>
-        <w:rFonts w:hint="default" w:ascii="Cambria" w:hAnsi="Cambria" w:eastAsia="Cambria" w:cs="Cambria"/>
-        <w:b/>
-        <w:lang w:val="en-IN"/>
-      </w:rPr>
+      <w:t xml:space="preserve">       24CS105</w:t>
     </w:r>
   </w:p>
 </w:hdr>
@@ -2692,18 +2722,15 @@
 </file>
 
 <file path=customXml/item1.xml><?xml version="1.0" encoding="utf-8"?>
-<p:properties xmlns:p="http://schemas.microsoft.com/office/2006/metadata/properties" xmlns:xsi="http://www.w3.org/2001/XMLSchema-instance" xmlns:pc="http://schemas.microsoft.com/office/infopath/2007/PartnerControls">
-  <documentManagement/>
-</p:properties>
+<?mso-contentType ?>
+<FormTemplates xmlns="http://schemas.microsoft.com/sharepoint/v3/contenttype/forms">
+  <Display>DocumentLibraryForm</Display>
+  <Edit>DocumentLibraryForm</Edit>
+  <New>DocumentLibraryForm</New>
+</FormTemplates>
 </file>
 
 <file path=customXml/item2.xml><?xml version="1.0" encoding="utf-8"?>
-<go:gDocsCustomXmlDataStorage xmlns:go="http://customooxmlschemas.google.com/" xmlns:r="http://schemas.openxmlformats.org/officeDocument/2006/relationships">
-  <go:docsCustomData xmlns:go="http://customooxmlschemas.google.com/" roundtripDataSignature="AMtx7mhUAgasSE2oHfmy5iqmtC3affXiiA==">AMUW2mU7Ao1DIvL8uZpgtHKTeJ/cio14OSOQ/ZznNszu92txLTe57Yptg6Og/ZdXMHzzW2a0T2a9jyVwrLzJlazXOq5bG0swdX8vNOAumUC8C9w1xuWOFwdscWSeT4WO92JCXlGcJTW5</go:docsCustomData>
-</go:gDocsCustomXmlDataStorage>
-</file>
-
-<file path=customXml/item3.xml><?xml version="1.0" encoding="utf-8"?>
 <ct:contentTypeSchema xmlns:ct="http://schemas.microsoft.com/office/2006/metadata/contentType" xmlns:ma="http://schemas.microsoft.com/office/2006/metadata/properties/metaAttributes" ct:_="" ma:_="" ma:contentTypeName="Document" ma:contentTypeID="0x010100B7627595832415499CF7CB08729C3DDC" ma:contentTypeVersion="0" ma:contentTypeDescription="Create a new document." ma:contentTypeScope="" ma:versionID="691fabae353c3b22e69db9c91c2d1e62">
   <xsd:schema xmlns:xsd="http://www.w3.org/2001/XMLSchema" xmlns:xs="http://www.w3.org/2001/XMLSchema" xmlns:p="http://schemas.microsoft.com/office/2006/metadata/properties" targetNamespace="http://schemas.microsoft.com/office/2006/metadata/properties" ma:root="true" ma:fieldsID="4b795196365d0a2ba85bf44c386000f7">
     <xsd:element name="properties">
@@ -2817,35 +2844,38 @@
 </ct:contentTypeSchema>
 </file>
 
+<file path=customXml/item3.xml><?xml version="1.0" encoding="utf-8"?>
+<go:gDocsCustomXmlDataStorage xmlns:go="http://customooxmlschemas.google.com/" xmlns:r="http://schemas.openxmlformats.org/officeDocument/2006/relationships">
+  <go:docsCustomData xmlns:go="http://customooxmlschemas.google.com/" roundtripDataSignature="AMtx7mhUAgasSE2oHfmy5iqmtC3affXiiA==">AMUW2mU7Ao1DIvL8uZpgtHKTeJ/cio14OSOQ/ZznNszu92txLTe57Yptg6Og/ZdXMHzzW2a0T2a9jyVwrLzJlazXOq5bG0swdX8vNOAumUC8C9w1xuWOFwdscWSeT4WO92JCXlGcJTW5</go:docsCustomData>
+</go:gDocsCustomXmlDataStorage>
+</file>
+
 <file path=customXml/item4.xml><?xml version="1.0" encoding="utf-8"?>
-<?mso-contentType ?>
-<FormTemplates xmlns="http://schemas.microsoft.com/sharepoint/v3/contenttype/forms">
-  <Display>DocumentLibraryForm</Display>
-  <Edit>DocumentLibraryForm</Edit>
-  <New>DocumentLibraryForm</New>
-</FormTemplates>
+<p:properties xmlns:p="http://schemas.microsoft.com/office/2006/metadata/properties" xmlns:xsi="http://www.w3.org/2001/XMLSchema-instance" xmlns:pc="http://schemas.microsoft.com/office/infopath/2007/PartnerControls">
+  <documentManagement/>
+</p:properties>
 </file>
 
 <file path=customXml/itemProps1.xml><?xml version="1.0" encoding="utf-8"?>
-<ds:datastoreItem xmlns:ds="http://schemas.openxmlformats.org/officeDocument/2006/customXml" ds:itemID="{F999CDE0-7094-4A5F-B9FA-96517C574186}">
+<ds:datastoreItem xmlns:ds="http://schemas.openxmlformats.org/officeDocument/2006/customXml" ds:itemID="{EBB2D1F6-627C-4704-90BA-19F6ECA77424}">
   <ds:schemaRefs/>
 </ds:datastoreItem>
 </file>
 
 <file path=customXml/itemProps2.xml><?xml version="1.0" encoding="utf-8"?>
+<ds:datastoreItem xmlns:ds="http://schemas.openxmlformats.org/officeDocument/2006/customXml" ds:itemID="{FFCC6A10-BC7D-4D00-86B2-7D7DFB89FDA4}">
+  <ds:schemaRefs/>
+</ds:datastoreItem>
+</file>
+
+<file path=customXml/itemProps3.xml><?xml version="1.0" encoding="utf-8"?>
 <ds:datastoreItem xmlns:ds="http://schemas.openxmlformats.org/officeDocument/2006/customXml" ds:itemID="{11111111-1234-1234-1234-123412341234}">
   <ds:schemaRefs/>
 </ds:datastoreItem>
 </file>
 
-<file path=customXml/itemProps3.xml><?xml version="1.0" encoding="utf-8"?>
-<ds:datastoreItem xmlns:ds="http://schemas.openxmlformats.org/officeDocument/2006/customXml" ds:itemID="{FFCC6A10-BC7D-4D00-86B2-7D7DFB89FDA4}">
-  <ds:schemaRefs/>
-</ds:datastoreItem>
-</file>
-
 <file path=customXml/itemProps4.xml><?xml version="1.0" encoding="utf-8"?>
-<ds:datastoreItem xmlns:ds="http://schemas.openxmlformats.org/officeDocument/2006/customXml" ds:itemID="{EBB2D1F6-627C-4704-90BA-19F6ECA77424}">
+<ds:datastoreItem xmlns:ds="http://schemas.openxmlformats.org/officeDocument/2006/customXml" ds:itemID="{F999CDE0-7094-4A5F-B9FA-96517C574186}">
   <ds:schemaRefs/>
 </ds:datastoreItem>
 </file>
</xml_diff>

<commit_message>
Complete required screenshots for Practical 3
</commit_message>
<xml_diff>
--- a/pract-3-awdf-24cs105.docx
+++ b/pract-3-awdf-24cs105.docx
@@ -1480,6 +1480,50 @@
       </w:r>
       <w:r>
         <w:t>Rudra Vaghela | ID: 24CS105 | Email: 24cs105@charusat.edu.in | Semester: 5th Sem | Program: B.Tech | Department: CSE-CSPIT</w:t>
+      </w:r>
+    </w:p>
+    <w:p>
+      <w:r>
+        <w:rPr>
+          <w:b/>
+        </w:rPr>
+        <w:t>Additional Application Output - Practical 3</w:t>
+      </w:r>
+    </w:p>
+    <w:p>
+      <w:r>
+        <w:drawing>
+          <wp:inline xmlns:a="http://schemas.openxmlformats.org/drawingml/2006/main" xmlns:pic="http://schemas.openxmlformats.org/drawingml/2006/picture">
+            <wp:extent cx="5760720" cy="7229139"/>
+            <wp:docPr id="9" name="Picture 9"/>
+            <wp:cNvGraphicFramePr>
+              <a:graphicFrameLocks noChangeAspect="1"/>
+            </wp:cNvGraphicFramePr>
+            <a:graphic>
+              <a:graphicData uri="http://schemas.openxmlformats.org/drawingml/2006/picture">
+                <pic:pic>
+                  <pic:nvPicPr>
+                    <pic:cNvPr id="0" name="rudra-practical-3-projects.png"/>
+                    <pic:cNvPicPr/>
+                  </pic:nvPicPr>
+                  <pic:blipFill>
+                    <a:blip r:embed="rId21"/>
+                    <a:stretch>
+                      <a:fillRect/>
+                    </a:stretch>
+                  </pic:blipFill>
+                  <pic:spPr>
+                    <a:xfrm>
+                      <a:off x="0" y="0"/>
+                      <a:ext cx="5760720" cy="7229139"/>
+                    </a:xfrm>
+                    <a:prstGeom prst="rect"/>
+                  </pic:spPr>
+                </pic:pic>
+              </a:graphicData>
+            </a:graphic>
+          </wp:inline>
+        </w:drawing>
       </w:r>
     </w:p>
     <w:sectPr>

</xml_diff>